<commit_message>
feat(ui): 引入 ECharts 与 Element Plus 优化图表和表单控件
</commit_message>
<xml_diff>
--- a/docs/2026-09-21-SLD水果市场销售分析系统报价单.docx
+++ b/docs/2026-09-21-SLD水果市场销售分析系统报价单.docx
@@ -21,7 +21,7 @@
     <w:p>
       <w:pPr/>
       <w:r>
-        <w:t>文档版本：V0.1  |  编制日期：2026-09-21  |  状态：待费用明细补充后定稿</w:t>
+        <w:t>文档版本：V0.3  |  编制日期：2026-09-21  |  状态：已按最新口径更新，腾讯会议计费方式确认后定稿</w:t>
       </w:r>
     </w:p>
     <w:p>
@@ -67,7 +67,7 @@
         <w:pStyle w:val="ListBullet"/>
       </w:pPr>
       <w:r>
-        <w:t>工作量依据：`docs/2026-09-21-系统迭代过程与功能工作量清单.md` 及仓库 Git 提交历史、测试与交付记录。</w:t>
+        <w:t>工作量依据：`docs/2026-09-21-系统迭代过程与功能工作量清单.md`、`docs/lwq/项目成本计算.md`、`docs/lwq/会议纪要汇总_20260907-20260921.xlsx` 及仓库 Git 提交历史、测试与交付记录。</w:t>
       </w:r>
     </w:p>
     <w:p>
@@ -245,7 +245,7 @@
           </w:tcPr>
           <w:p>
             <w:r>
-              <w:t>工程师 A（开发实施，偏研发）</w:t>
+              <w:t>梁万琪（开发实施）</w:t>
             </w:r>
           </w:p>
         </w:tc>
@@ -265,7 +265,7 @@
           </w:tcPr>
           <w:p>
             <w:r>
-              <w:t>1 人</w:t>
+              <w:t>30 人日</w:t>
             </w:r>
           </w:p>
         </w:tc>
@@ -277,7 +277,7 @@
           </w:tcPr>
           <w:p>
             <w:r>
-              <w:t>工程师 B（实施运维，偏交付）</w:t>
+              <w:t>林霆枫（实施运维）</w:t>
             </w:r>
           </w:p>
         </w:tc>
@@ -297,7 +297,7 @@
           </w:tcPr>
           <w:p>
             <w:r>
-              <w:t>1 人</w:t>
+              <w:t>30 人日</w:t>
             </w:r>
           </w:p>
         </w:tc>
@@ -314,624 +314,7 @@
     <w:p>
       <w:pPr/>
       <w:r>
-        <w:t>依据已交付系统迭代过程，全项目合计工作量约 35–43 人日，按两名工程师分工如下：</w:t>
-      </w:r>
-    </w:p>
-    <w:tbl>
-      <w:tblPr>
-        <w:tblStyle w:val="TableGrid"/>
-        <w:tblW w:type="auto" w:w="0"/>
-        <w:tblLook w:firstColumn="1" w:firstRow="1" w:lastColumn="0" w:lastRow="0" w:noHBand="0" w:noVBand="1" w:val="04A0"/>
-      </w:tblPr>
-      <w:tblGrid>
-        <w:gridCol w:w="2379"/>
-        <w:gridCol w:w="2379"/>
-        <w:gridCol w:w="2379"/>
-        <w:gridCol w:w="2379"/>
-      </w:tblGrid>
-      <w:tr>
-        <w:tc>
-          <w:tcPr>
-            <w:tcW w:type="dxa" w:w="2379"/>
-          </w:tcPr>
-          <w:p>
-            <w:r>
-              <w:rPr>
-                <w:b/>
-              </w:rPr>
-              <w:t>工作包</w:t>
-            </w:r>
-          </w:p>
-        </w:tc>
-        <w:tc>
-          <w:tcPr>
-            <w:tcW w:type="dxa" w:w="2379"/>
-          </w:tcPr>
-          <w:p>
-            <w:r>
-              <w:rPr>
-                <w:b/>
-              </w:rPr>
-              <w:t>主要工作内容</w:t>
-            </w:r>
-          </w:p>
-        </w:tc>
-        <w:tc>
-          <w:tcPr>
-            <w:tcW w:type="dxa" w:w="2379"/>
-          </w:tcPr>
-          <w:p>
-            <w:r>
-              <w:rPr>
-                <w:b/>
-              </w:rPr>
-              <w:t>工程师 A</w:t>
-            </w:r>
-          </w:p>
-        </w:tc>
-        <w:tc>
-          <w:tcPr>
-            <w:tcW w:type="dxa" w:w="2379"/>
-          </w:tcPr>
-          <w:p>
-            <w:r>
-              <w:rPr>
-                <w:b/>
-              </w:rPr>
-              <w:t>工程师 B</w:t>
-            </w:r>
-          </w:p>
-        </w:tc>
-      </w:tr>
-      <w:tr>
-        <w:tc>
-          <w:tcPr>
-            <w:tcW w:type="dxa" w:w="2379"/>
-          </w:tcPr>
-          <w:p>
-            <w:r>
-              <w:t>需求与设计</w:t>
-            </w:r>
-          </w:p>
-        </w:tc>
-        <w:tc>
-          <w:tcPr>
-            <w:tcW w:type="dxa" w:w="2379"/>
-          </w:tcPr>
-          <w:p>
-            <w:r>
-              <w:t>业务口径、流程、页面结构、架构与实施计划</w:t>
-            </w:r>
-          </w:p>
-        </w:tc>
-        <w:tc>
-          <w:tcPr>
-            <w:tcW w:type="dxa" w:w="2379"/>
-          </w:tcPr>
-          <w:p>
-            <w:r>
-              <w:t>2–2.5</w:t>
-            </w:r>
-          </w:p>
-        </w:tc>
-        <w:tc>
-          <w:tcPr>
-            <w:tcW w:type="dxa" w:w="2379"/>
-          </w:tcPr>
-          <w:p>
-            <w:r>
-              <w:t>1–1.5</w:t>
-            </w:r>
-          </w:p>
-        </w:tc>
-      </w:tr>
-      <w:tr>
-        <w:tc>
-          <w:tcPr>
-            <w:tcW w:type="dxa" w:w="2379"/>
-          </w:tcPr>
-          <w:p>
-            <w:r>
-              <w:t>工程环境与部署</w:t>
-            </w:r>
-          </w:p>
-        </w:tc>
-        <w:tc>
-          <w:tcPr>
-            <w:tcW w:type="dxa" w:w="2379"/>
-          </w:tcPr>
-          <w:p>
-            <w:r>
-              <w:t>项目初始化、MySQL、Nginx、Docker、启动脚本</w:t>
-            </w:r>
-          </w:p>
-        </w:tc>
-        <w:tc>
-          <w:tcPr>
-            <w:tcW w:type="dxa" w:w="2379"/>
-          </w:tcPr>
-          <w:p>
-            <w:r>
-              <w:t>1</w:t>
-            </w:r>
-          </w:p>
-        </w:tc>
-        <w:tc>
-          <w:tcPr>
-            <w:tcW w:type="dxa" w:w="2379"/>
-          </w:tcPr>
-          <w:p>
-            <w:r>
-              <w:t>1.5–2</w:t>
-            </w:r>
-          </w:p>
-        </w:tc>
-      </w:tr>
-      <w:tr>
-        <w:tc>
-          <w:tcPr>
-            <w:tcW w:type="dxa" w:w="2379"/>
-          </w:tcPr>
-          <w:p>
-            <w:r>
-              <w:t>数据模型与迁移</w:t>
-            </w:r>
-          </w:p>
-        </w:tc>
-        <w:tc>
-          <w:tcPr>
-            <w:tcW w:type="dxa" w:w="2379"/>
-          </w:tcPr>
-          <w:p>
-            <w:r>
-              <w:t>数据表、等级/单号/商号口径、迁移脚本</w:t>
-            </w:r>
-          </w:p>
-        </w:tc>
-        <w:tc>
-          <w:tcPr>
-            <w:tcW w:type="dxa" w:w="2379"/>
-          </w:tcPr>
-          <w:p>
-            <w:r>
-              <w:t>3–3.5</w:t>
-            </w:r>
-          </w:p>
-        </w:tc>
-        <w:tc>
-          <w:tcPr>
-            <w:tcW w:type="dxa" w:w="2379"/>
-          </w:tcPr>
-          <w:p>
-            <w:r>
-              <w:t>0.5</w:t>
-            </w:r>
-          </w:p>
-        </w:tc>
-      </w:tr>
-      <w:tr>
-        <w:tc>
-          <w:tcPr>
-            <w:tcW w:type="dxa" w:w="2379"/>
-          </w:tcPr>
-          <w:p>
-            <w:r>
-              <w:t>文件导入与二次确认</w:t>
-            </w:r>
-          </w:p>
-        </w:tc>
-        <w:tc>
-          <w:tcPr>
-            <w:tcW w:type="dxa" w:w="2379"/>
-          </w:tcPr>
-          <w:p>
-            <w:r>
-              <w:t>多文件解析、草稿、复核、问题处理</w:t>
-            </w:r>
-          </w:p>
-        </w:tc>
-        <w:tc>
-          <w:tcPr>
-            <w:tcW w:type="dxa" w:w="2379"/>
-          </w:tcPr>
-          <w:p>
-            <w:r>
-              <w:t>3.5–4</w:t>
-            </w:r>
-          </w:p>
-        </w:tc>
-        <w:tc>
-          <w:tcPr>
-            <w:tcW w:type="dxa" w:w="2379"/>
-          </w:tcPr>
-          <w:p>
-            <w:r>
-              <w:t>0.5</w:t>
-            </w:r>
-          </w:p>
-        </w:tc>
-      </w:tr>
-      <w:tr>
-        <w:tc>
-          <w:tcPr>
-            <w:tcW w:type="dxa" w:w="2379"/>
-          </w:tcPr>
-          <w:p>
-            <w:r>
-              <w:t>手工录单</w:t>
-            </w:r>
-          </w:p>
-        </w:tc>
-        <w:tc>
-          <w:tcPr>
-            <w:tcW w:type="dxa" w:w="2379"/>
-          </w:tcPr>
-          <w:p>
-            <w:r>
-              <w:t>表单录单、字段配置、草稿、导出</w:t>
-            </w:r>
-          </w:p>
-        </w:tc>
-        <w:tc>
-          <w:tcPr>
-            <w:tcW w:type="dxa" w:w="2379"/>
-          </w:tcPr>
-          <w:p>
-            <w:r>
-              <w:t>2–2.5</w:t>
-            </w:r>
-          </w:p>
-        </w:tc>
-        <w:tc>
-          <w:tcPr>
-            <w:tcW w:type="dxa" w:w="2379"/>
-          </w:tcPr>
-          <w:p>
-            <w:r>
-              <w:t>0.5</w:t>
-            </w:r>
-          </w:p>
-        </w:tc>
-      </w:tr>
-      <w:tr>
-        <w:tc>
-          <w:tcPr>
-            <w:tcW w:type="dxa" w:w="2379"/>
-          </w:tcPr>
-          <w:p>
-            <w:r>
-              <w:t>看板与图表</w:t>
-            </w:r>
-          </w:p>
-        </w:tc>
-        <w:tc>
-          <w:tcPr>
-            <w:tcW w:type="dxa" w:w="2379"/>
-          </w:tcPr>
-          <w:p>
-            <w:r>
-              <w:t>总览、等级结构、手写 SVG 图表</w:t>
-            </w:r>
-          </w:p>
-        </w:tc>
-        <w:tc>
-          <w:tcPr>
-            <w:tcW w:type="dxa" w:w="2379"/>
-          </w:tcPr>
-          <w:p>
-            <w:r>
-              <w:t>2.5–3</w:t>
-            </w:r>
-          </w:p>
-        </w:tc>
-        <w:tc>
-          <w:tcPr>
-            <w:tcW w:type="dxa" w:w="2379"/>
-          </w:tcPr>
-          <w:p>
-            <w:r>
-              <w:t>0.5</w:t>
-            </w:r>
-          </w:p>
-        </w:tc>
-      </w:tr>
-      <w:tr>
-        <w:tc>
-          <w:tcPr>
-            <w:tcW w:type="dxa" w:w="2379"/>
-          </w:tcPr>
-          <w:p>
-            <w:r>
-              <w:t>对比诊断</w:t>
-            </w:r>
-          </w:p>
-        </w:tc>
-        <w:tc>
-          <w:tcPr>
-            <w:tcW w:type="dxa" w:w="2379"/>
-          </w:tcPr>
-          <w:p>
-            <w:r>
-              <w:t>单柜、货柜、品牌、等级规格</w:t>
-            </w:r>
-          </w:p>
-        </w:tc>
-        <w:tc>
-          <w:tcPr>
-            <w:tcW w:type="dxa" w:w="2379"/>
-          </w:tcPr>
-          <w:p>
-            <w:r>
-              <w:t>2.5–3</w:t>
-            </w:r>
-          </w:p>
-        </w:tc>
-        <w:tc>
-          <w:tcPr>
-            <w:tcW w:type="dxa" w:w="2379"/>
-          </w:tcPr>
-          <w:p>
-            <w:r>
-              <w:t>0.5</w:t>
-            </w:r>
-          </w:p>
-        </w:tc>
-      </w:tr>
-      <w:tr>
-        <w:tc>
-          <w:tcPr>
-            <w:tcW w:type="dxa" w:w="2379"/>
-          </w:tcPr>
-          <w:p>
-            <w:r>
-              <w:t>AI 问答与分析</w:t>
-            </w:r>
-          </w:p>
-        </w:tc>
-        <w:tc>
-          <w:tcPr>
-            <w:tcW w:type="dxa" w:w="2379"/>
-          </w:tcPr>
-          <w:p>
-            <w:r>
-              <w:t>顺仔问答、工具调用、分析结论、缓存</w:t>
-            </w:r>
-          </w:p>
-        </w:tc>
-        <w:tc>
-          <w:tcPr>
-            <w:tcW w:type="dxa" w:w="2379"/>
-          </w:tcPr>
-          <w:p>
-            <w:r>
-              <w:t>2–2.5</w:t>
-            </w:r>
-          </w:p>
-        </w:tc>
-        <w:tc>
-          <w:tcPr>
-            <w:tcW w:type="dxa" w:w="2379"/>
-          </w:tcPr>
-          <w:p>
-            <w:r>
-              <w:t>0.5</w:t>
-            </w:r>
-          </w:p>
-        </w:tc>
-      </w:tr>
-      <w:tr>
-        <w:tc>
-          <w:tcPr>
-            <w:tcW w:type="dxa" w:w="2379"/>
-          </w:tcPr>
-          <w:p>
-            <w:r>
-              <w:t>权限通知与导出</w:t>
-            </w:r>
-          </w:p>
-        </w:tc>
-        <w:tc>
-          <w:tcPr>
-            <w:tcW w:type="dxa" w:w="2379"/>
-          </w:tcPr>
-          <w:p>
-            <w:r>
-              <w:t>登录权限、通知、CSV/XLSX/PDF 导出</w:t>
-            </w:r>
-          </w:p>
-        </w:tc>
-        <w:tc>
-          <w:tcPr>
-            <w:tcW w:type="dxa" w:w="2379"/>
-          </w:tcPr>
-          <w:p>
-            <w:r>
-              <w:t>1.5–2</w:t>
-            </w:r>
-          </w:p>
-        </w:tc>
-        <w:tc>
-          <w:tcPr>
-            <w:tcW w:type="dxa" w:w="2379"/>
-          </w:tcPr>
-          <w:p>
-            <w:r>
-              <w:t>0.5</w:t>
-            </w:r>
-          </w:p>
-        </w:tc>
-      </w:tr>
-      <w:tr>
-        <w:tc>
-          <w:tcPr>
-            <w:tcW w:type="dxa" w:w="2379"/>
-          </w:tcPr>
-          <w:p>
-            <w:r>
-              <w:t>移动端与体验</w:t>
-            </w:r>
-          </w:p>
-        </w:tc>
-        <w:tc>
-          <w:tcPr>
-            <w:tcW w:type="dxa" w:w="2379"/>
-          </w:tcPr>
-          <w:p>
-            <w:r>
-              <w:t>响应式、卡片化、字号、导航</w:t>
-            </w:r>
-          </w:p>
-        </w:tc>
-        <w:tc>
-          <w:tcPr>
-            <w:tcW w:type="dxa" w:w="2379"/>
-          </w:tcPr>
-          <w:p>
-            <w:r>
-              <w:t>1.5–2</w:t>
-            </w:r>
-          </w:p>
-        </w:tc>
-        <w:tc>
-          <w:tcPr>
-            <w:tcW w:type="dxa" w:w="2379"/>
-          </w:tcPr>
-          <w:p>
-            <w:r>
-              <w:t>0.5</w:t>
-            </w:r>
-          </w:p>
-        </w:tc>
-      </w:tr>
-      <w:tr>
-        <w:tc>
-          <w:tcPr>
-            <w:tcW w:type="dxa" w:w="2379"/>
-          </w:tcPr>
-          <w:p>
-            <w:r>
-              <w:t>测试与收口</w:t>
-            </w:r>
-          </w:p>
-        </w:tc>
-        <w:tc>
-          <w:tcPr>
-            <w:tcW w:type="dxa" w:w="2379"/>
-          </w:tcPr>
-          <w:p>
-            <w:r>
-              <w:t>自动化测试、浏览器回归、文档沉淀</w:t>
-            </w:r>
-          </w:p>
-        </w:tc>
-        <w:tc>
-          <w:tcPr>
-            <w:tcW w:type="dxa" w:w="2379"/>
-          </w:tcPr>
-          <w:p>
-            <w:r>
-              <w:t>2.5–3</w:t>
-            </w:r>
-          </w:p>
-        </w:tc>
-        <w:tc>
-          <w:tcPr>
-            <w:tcW w:type="dxa" w:w="2379"/>
-          </w:tcPr>
-          <w:p>
-            <w:r>
-              <w:t>2–2.5</w:t>
-            </w:r>
-          </w:p>
-        </w:tc>
-      </w:tr>
-      <w:tr>
-        <w:tc>
-          <w:tcPr>
-            <w:tcW w:type="dxa" w:w="2379"/>
-          </w:tcPr>
-          <w:p>
-            <w:r>
-              <w:t>培训、上线与运维支持</w:t>
-            </w:r>
-          </w:p>
-        </w:tc>
-        <w:tc>
-          <w:tcPr>
-            <w:tcW w:type="dxa" w:w="2379"/>
-          </w:tcPr>
-          <w:p>
-            <w:r>
-              <w:t>部署交接、培训、问题处理、验收支持</w:t>
-            </w:r>
-          </w:p>
-        </w:tc>
-        <w:tc>
-          <w:tcPr>
-            <w:tcW w:type="dxa" w:w="2379"/>
-          </w:tcPr>
-          <w:p>
-            <w:r>
-              <w:t>1</w:t>
-            </w:r>
-          </w:p>
-        </w:tc>
-        <w:tc>
-          <w:tcPr>
-            <w:tcW w:type="dxa" w:w="2379"/>
-          </w:tcPr>
-          <w:p>
-            <w:r>
-              <w:t>1.5–2.5</w:t>
-            </w:r>
-          </w:p>
-        </w:tc>
-      </w:tr>
-      <w:tr>
-        <w:tc>
-          <w:tcPr>
-            <w:tcW w:type="dxa" w:w="2379"/>
-          </w:tcPr>
-          <w:p>
-            <w:r>
-              <w:t>合计</w:t>
-            </w:r>
-          </w:p>
-        </w:tc>
-        <w:tc>
-          <w:tcPr>
-            <w:tcW w:type="dxa" w:w="2379"/>
-          </w:tcPr>
-          <w:p>
-            <w:r/>
-          </w:p>
-        </w:tc>
-        <w:tc>
-          <w:tcPr>
-            <w:tcW w:type="dxa" w:w="2379"/>
-          </w:tcPr>
-          <w:p>
-            <w:r>
-              <w:t>25–30</w:t>
-            </w:r>
-          </w:p>
-        </w:tc>
-        <w:tc>
-          <w:tcPr>
-            <w:tcW w:type="dxa" w:w="2379"/>
-          </w:tcPr>
-          <w:p>
-            <w:r>
-              <w:t>10–13</w:t>
-            </w:r>
-          </w:p>
-        </w:tc>
-      </w:tr>
-    </w:tbl>
-    <w:p>
-      <w:pPr/>
-      <w:r>
-        <w:t>全项目合计：35–43 人日。</w:t>
+        <w:t>依据 `docs/lwq/项目成本计算.md` 的预估，两名工程师各投入 30 人日，合计 60 人日。</w:t>
       </w:r>
     </w:p>
     <w:p>
@@ -1015,7 +398,7 @@
           </w:tcPr>
           <w:p>
             <w:r>
-              <w:t>工程师 A 开发实施费</w:t>
+              <w:t>梁万琪开发实施费</w:t>
             </w:r>
           </w:p>
         </w:tc>
@@ -1025,7 +408,7 @@
           </w:tcPr>
           <w:p>
             <w:r>
-              <w:t>25–30 人日</w:t>
+              <w:t>30 人日</w:t>
             </w:r>
           </w:p>
         </w:tc>
@@ -1035,7 +418,7 @@
           </w:tcPr>
           <w:p>
             <w:r>
-              <w:t>¥______ /人日</w:t>
+              <w:t>¥1,500 /人日</w:t>
             </w:r>
           </w:p>
         </w:tc>
@@ -1045,7 +428,7 @@
           </w:tcPr>
           <w:p>
             <w:r>
-              <w:t>¥______</w:t>
+              <w:t>¥45,000.00</w:t>
             </w:r>
           </w:p>
         </w:tc>
@@ -1057,7 +440,7 @@
           </w:tcPr>
           <w:p>
             <w:r>
-              <w:t>工程师 B 实施运维费</w:t>
+              <w:t>林霆枫实施运维费</w:t>
             </w:r>
           </w:p>
         </w:tc>
@@ -1067,7 +450,7 @@
           </w:tcPr>
           <w:p>
             <w:r>
-              <w:t>10–13 人日</w:t>
+              <w:t>30 人日</w:t>
             </w:r>
           </w:p>
         </w:tc>
@@ -1077,7 +460,7 @@
           </w:tcPr>
           <w:p>
             <w:r>
-              <w:t>¥______ /人日</w:t>
+              <w:t>¥1,500 /人日</w:t>
             </w:r>
           </w:p>
         </w:tc>
@@ -1087,7 +470,7 @@
           </w:tcPr>
           <w:p>
             <w:r>
-              <w:t>¥______</w:t>
+              <w:t>¥45,000.00</w:t>
             </w:r>
           </w:p>
         </w:tc>
@@ -1109,7 +492,7 @@
           </w:tcPr>
           <w:p>
             <w:r>
-              <w:t>35–43 人日</w:t>
+              <w:t>60 人日</w:t>
             </w:r>
           </w:p>
         </w:tc>
@@ -1129,12 +512,70 @@
           </w:tcPr>
           <w:p>
             <w:r>
-              <w:t>¥______</w:t>
+              <w:t>¥90,000.00</w:t>
             </w:r>
           </w:p>
         </w:tc>
       </w:tr>
     </w:tbl>
+    <w:p>
+      <w:pPr>
+        <w:pStyle w:val="Heading2"/>
+      </w:pPr>
+      <w:r>
+        <w:t>3.4 工程师人日单价市场参考</w:t>
+      </w:r>
+    </w:p>
+    <w:p>
+      <w:pPr/>
+      <w:r>
+        <w:t>本参考仅用于说明单价合理性，不作为承诺或定价上限：</w:t>
+      </w:r>
+    </w:p>
+    <w:p>
+      <w:pPr>
+        <w:pStyle w:val="ListBullet"/>
+      </w:pPr>
+      <w:r>
+        <w:t>全栈 / 平台类工程师市场常见区间：约 ¥1,000–2,500 元/人日。</w:t>
+      </w:r>
+    </w:p>
+    <w:p>
+      <w:pPr>
+        <w:pStyle w:val="ListBullet"/>
+      </w:pPr>
+      <w:r>
+        <w:t>政府或企业采购类 Java 工程师：高级 5 年以上约 ¥1,500，中级 3–5 年约 ¥1,300，初级 1–3 年约 ¥1,000。</w:t>
+      </w:r>
+    </w:p>
+    <w:p>
+      <w:pPr>
+        <w:pStyle w:val="ListBullet"/>
+      </w:pPr>
+      <w:r>
+        <w:t>工信部电子第五研究所外协参考：开发工程师初级约 ¥900，中级约 ¥1,100，高级约 ¥1,300；不同工种最高限价可上探至约 ¥1,580。</w:t>
+      </w:r>
+    </w:p>
+    <w:p>
+      <w:pPr>
+        <w:pStyle w:val="ListBullet"/>
+      </w:pPr>
+      <w:r>
+        <w:t>小程序开发人工参考：约 ¥500–1,000 元/人日。</w:t>
+      </w:r>
+    </w:p>
+    <w:p>
+      <w:pPr/>
+      <w:r>
+        <w:t>结论：本项目按 ¥1,500 元/人日计价，处于市场中等偏上且可解释的合理区间。</w:t>
+      </w:r>
+    </w:p>
+    <w:p>
+      <w:pPr/>
+      <w:r>
+        <w:t>详细来源见 `docs/lwq/工程师人日市场参考.md`。</w:t>
+      </w:r>
+    </w:p>
     <w:p>
       <w:pPr>
         <w:pStyle w:val="Heading1"/>
@@ -1178,7 +619,7 @@
               <w:rPr>
                 <w:b/>
               </w:rPr>
-              <w:t>建议内容</w:t>
+              <w:t>说明</w:t>
             </w:r>
           </w:p>
         </w:tc>
@@ -1191,7 +632,7 @@
               <w:rPr>
                 <w:b/>
               </w:rPr>
-              <w:t>数量/周期</w:t>
+              <w:t>数量</w:t>
             </w:r>
           </w:p>
         </w:tc>
@@ -1226,7 +667,7 @@
           </w:tcPr>
           <w:p>
             <w:r>
-              <w:t>托管前后端应用；规格按实际访问量确认</w:t>
+              <w:t>托管生产环境前后端应用</w:t>
             </w:r>
           </w:p>
         </w:tc>
@@ -1236,7 +677,7 @@
           </w:tcPr>
           <w:p>
             <w:r>
-              <w:t>1 台 × 1 年</w:t>
+              <w:t>1 台</w:t>
             </w:r>
           </w:p>
         </w:tc>
@@ -1246,7 +687,7 @@
           </w:tcPr>
           <w:p>
             <w:r>
-              <w:t>¥______</w:t>
+              <w:t>含于合计</w:t>
             </w:r>
           </w:p>
         </w:tc>
@@ -1268,7 +709,7 @@
           </w:tcPr>
           <w:p>
             <w:r>
-              <w:t>业务数据库；规格与存储按数据量确认</w:t>
+              <w:t>生产业务数据库</w:t>
             </w:r>
           </w:p>
         </w:tc>
@@ -1278,7 +719,7 @@
           </w:tcPr>
           <w:p>
             <w:r>
-              <w:t>1 实例 × 1 年</w:t>
+              <w:t>1 台</w:t>
             </w:r>
           </w:p>
         </w:tc>
@@ -1288,7 +729,7 @@
           </w:tcPr>
           <w:p>
             <w:r>
-              <w:t>¥______</w:t>
+              <w:t>含于合计</w:t>
             </w:r>
           </w:p>
         </w:tc>
@@ -1300,7 +741,7 @@
           </w:tcPr>
           <w:p>
             <w:r>
-              <w:t>域名注册/续费</w:t>
+              <w:t>域名</w:t>
             </w:r>
           </w:p>
         </w:tc>
@@ -1310,7 +751,7 @@
           </w:tcPr>
           <w:p>
             <w:r>
-              <w:t>用于系统访问入口</w:t>
+              <w:t>系统访问入口</w:t>
             </w:r>
           </w:p>
         </w:tc>
@@ -1320,7 +761,7 @@
           </w:tcPr>
           <w:p>
             <w:r>
-              <w:t>1 个 × 1 年</w:t>
+              <w:t>1 个</w:t>
             </w:r>
           </w:p>
         </w:tc>
@@ -1330,7 +771,7 @@
           </w:tcPr>
           <w:p>
             <w:r>
-              <w:t>¥______</w:t>
+              <w:t>含于合计</w:t>
             </w:r>
           </w:p>
         </w:tc>
@@ -1342,7 +783,7 @@
           </w:tcPr>
           <w:p>
             <w:r>
-              <w:t>备案、DNS 与 SSL 全打通</w:t>
+              <w:t>安全服务</w:t>
             </w:r>
           </w:p>
         </w:tc>
@@ -1352,7 +793,7 @@
           </w:tcPr>
           <w:p>
             <w:r>
-              <w:t>域名解析、ICP 备案协助、HTTPS 证书配置</w:t>
+              <w:t>安全防护等</w:t>
             </w:r>
           </w:p>
         </w:tc>
@@ -1362,7 +803,7 @@
           </w:tcPr>
           <w:p>
             <w:r>
-              <w:t>一次性/按年</w:t>
+              <w:t>若干</w:t>
             </w:r>
           </w:p>
         </w:tc>
@@ -1372,7 +813,7 @@
           </w:tcPr>
           <w:p>
             <w:r>
-              <w:t>¥______</w:t>
+              <w:t>含于合计</w:t>
             </w:r>
           </w:p>
         </w:tc>
@@ -1384,7 +825,91 @@
           </w:tcPr>
           <w:p>
             <w:r>
-              <w:t>云资源与域名小计</w:t>
+              <w:t>生产云资源与域名小计</w:t>
+            </w:r>
+          </w:p>
+        </w:tc>
+        <w:tc>
+          <w:tcPr>
+            <w:tcW w:type="dxa" w:w="2379"/>
+          </w:tcPr>
+          <w:p>
+            <w:r>
+              <w:t>2026-09-20 台账合计，四项未拆单列</w:t>
+            </w:r>
+          </w:p>
+        </w:tc>
+        <w:tc>
+          <w:tcPr>
+            <w:tcW w:type="dxa" w:w="2379"/>
+          </w:tcPr>
+          <w:p>
+            <w:r>
+              <w:t>—</w:t>
+            </w:r>
+          </w:p>
+        </w:tc>
+        <w:tc>
+          <w:tcPr>
+            <w:tcW w:type="dxa" w:w="2379"/>
+          </w:tcPr>
+          <w:p>
+            <w:r>
+              <w:t>¥3,299.28</w:t>
+            </w:r>
+          </w:p>
+        </w:tc>
+      </w:tr>
+      <w:tr>
+        <w:tc>
+          <w:tcPr>
+            <w:tcW w:type="dxa" w:w="2379"/>
+          </w:tcPr>
+          <w:p>
+            <w:r>
+              <w:t>预留测试服务器</w:t>
+            </w:r>
+          </w:p>
+        </w:tc>
+        <w:tc>
+          <w:tcPr>
+            <w:tcW w:type="dxa" w:w="2379"/>
+          </w:tcPr>
+          <w:p>
+            <w:r>
+              <w:t>4C8G，用于测试 / 预发布环境</w:t>
+            </w:r>
+          </w:p>
+        </w:tc>
+        <w:tc>
+          <w:tcPr>
+            <w:tcW w:type="dxa" w:w="2379"/>
+          </w:tcPr>
+          <w:p>
+            <w:r>
+              <w:t>1 台</w:t>
+            </w:r>
+          </w:p>
+        </w:tc>
+        <w:tc>
+          <w:tcPr>
+            <w:tcW w:type="dxa" w:w="2379"/>
+          </w:tcPr>
+          <w:p>
+            <w:r>
+              <w:t>¥3,500.00</w:t>
+            </w:r>
+          </w:p>
+        </w:tc>
+      </w:tr>
+      <w:tr>
+        <w:tc>
+          <w:tcPr>
+            <w:tcW w:type="dxa" w:w="2379"/>
+          </w:tcPr>
+          <w:p>
+            <w:r>
+              <w:t>云资源与域名合计</w:t>
             </w:r>
           </w:p>
         </w:tc>
@@ -1410,7 +935,7 @@
           </w:tcPr>
           <w:p>
             <w:r>
-              <w:t>¥______</w:t>
+              <w:t>¥6,799.28</w:t>
             </w:r>
           </w:p>
         </w:tc>
@@ -1421,7 +946,7 @@
         <w:pStyle w:val="Heading1"/>
       </w:pPr>
       <w:r>
-        <w:t>5. 微信生态开通</w:t>
+        <w:t>5. 微信生态与企业微信认证</w:t>
       </w:r>
     </w:p>
     <w:tbl>
@@ -1493,7 +1018,7 @@
           </w:tcPr>
           <w:p>
             <w:r>
-              <w:t>认证/开通，用于业务通知与登录场景对接</w:t>
+              <w:t>认证注册</w:t>
             </w:r>
           </w:p>
         </w:tc>
@@ -1503,7 +1028,7 @@
           </w:tcPr>
           <w:p>
             <w:r>
-              <w:t>¥______</w:t>
+              <w:t>¥300.00</w:t>
             </w:r>
           </w:p>
         </w:tc>
@@ -1525,7 +1050,7 @@
           </w:tcPr>
           <w:p>
             <w:r>
-              <w:t>认证/开通，用于移动端入口</w:t>
+              <w:t>认证注册</w:t>
             </w:r>
           </w:p>
         </w:tc>
@@ -1535,7 +1060,7 @@
           </w:tcPr>
           <w:p>
             <w:r>
-              <w:t>¥______</w:t>
+              <w:t>¥300.00</w:t>
             </w:r>
           </w:p>
         </w:tc>
@@ -1557,7 +1082,7 @@
           </w:tcPr>
           <w:p>
             <w:r>
-              <w:t>认证/开通，用于内部协同与客户触达</w:t>
+              <w:t>实名认证</w:t>
             </w:r>
           </w:p>
         </w:tc>
@@ -1567,7 +1092,7 @@
           </w:tcPr>
           <w:p>
             <w:r>
-              <w:t>¥______</w:t>
+              <w:t>¥300.00</w:t>
             </w:r>
           </w:p>
         </w:tc>
@@ -1579,7 +1104,7 @@
           </w:tcPr>
           <w:p>
             <w:r>
-              <w:t>微信生态小计</w:t>
+              <w:t>小计</w:t>
             </w:r>
           </w:p>
         </w:tc>
@@ -1597,18 +1122,30 @@
           </w:tcPr>
           <w:p>
             <w:r>
-              <w:t>¥______</w:t>
+              <w:t>¥900.00</w:t>
             </w:r>
           </w:p>
         </w:tc>
       </w:tr>
     </w:tbl>
     <w:p>
+      <w:pPr/>
+      <w:r>
+        <w:t>说明：DeepSeek 大模型开发与调用成本属于团队内部研发 / 交付成本，不列入客户报价；如客户后续要求独立 AI 账号或专属模型资源，另行报价。</w:t>
+      </w:r>
+    </w:p>
+    <w:p>
       <w:pPr>
         <w:pStyle w:val="Heading1"/>
       </w:pPr>
       <w:r>
         <w:t>6. 持续需求沟通与演示确认</w:t>
+      </w:r>
+    </w:p>
+    <w:p>
+      <w:pPr/>
+      <w:r>
+        <w:t>依据 `docs/lwq/会议纪要汇总_20260907-20260921.xlsx`，本项目已完成腾讯会议沟通与演示记录统计：共 20 场，累计 1,200 分钟（20 小时），拆分出 151 条需求项 / 议题。</w:t>
       </w:r>
     </w:p>
     <w:tbl>
@@ -1718,7 +1255,7 @@
           </w:tcPr>
           <w:p>
             <w:r>
-              <w:t>____ 次</w:t>
+              <w:t>20 场 / 20 小时</w:t>
             </w:r>
           </w:p>
         </w:tc>
@@ -1728,7 +1265,7 @@
           </w:tcPr>
           <w:p>
             <w:r>
-              <w:t>¥______ /次</w:t>
+              <w:t>待确认</w:t>
             </w:r>
           </w:p>
         </w:tc>
@@ -1738,7 +1275,7 @@
           </w:tcPr>
           <w:p>
             <w:r>
-              <w:t>¥______</w:t>
+              <w:t>待确认</w:t>
             </w:r>
           </w:p>
         </w:tc>
@@ -1770,7 +1307,7 @@
           </w:tcPr>
           <w:p>
             <w:r>
-              <w:t>____ 次</w:t>
+              <w:t>已含于上述会议记录</w:t>
             </w:r>
           </w:p>
         </w:tc>
@@ -1780,7 +1317,7 @@
           </w:tcPr>
           <w:p>
             <w:r>
-              <w:t>¥______ /次</w:t>
+              <w:t>待确认</w:t>
             </w:r>
           </w:p>
         </w:tc>
@@ -1790,7 +1327,7 @@
           </w:tcPr>
           <w:p>
             <w:r>
-              <w:t>¥______</w:t>
+              <w:t>待确认</w:t>
             </w:r>
           </w:p>
         </w:tc>
@@ -1803,6 +1340,16 @@
           <w:p>
             <w:r>
               <w:t>持续沟通与演示小计</w:t>
+            </w:r>
+          </w:p>
+        </w:tc>
+        <w:tc>
+          <w:tcPr>
+            <w:tcW w:type="dxa" w:w="1904"/>
+          </w:tcPr>
+          <w:p>
+            <w:r>
+              <w:t>具体计费方式待客户确认</w:t>
             </w:r>
           </w:p>
         </w:tc>
@@ -1827,16 +1374,8 @@
             <w:tcW w:type="dxa" w:w="1904"/>
           </w:tcPr>
           <w:p>
-            <w:r/>
-          </w:p>
-        </w:tc>
-        <w:tc>
-          <w:tcPr>
-            <w:tcW w:type="dxa" w:w="1904"/>
-          </w:tcPr>
-          <w:p>
             <w:r>
-              <w:t>¥______</w:t>
+              <w:t>待确认</w:t>
             </w:r>
           </w:p>
         </w:tc>
@@ -1845,7 +1384,7 @@
     <w:p>
       <w:pPr/>
       <w:r>
-        <w:t>建议方式：以腾讯会议远程会议为主，每轮先演示功能，再确认需求与验收结论；可按次计费，也可打包为固定服务费。</w:t>
+        <w:t>建议方式：以腾讯会议远程会议为主，每轮先演示功能，再确认需求与验收结论；可按次计费，也可打包为固定服务费，或纳入工程师人日范围。</w:t>
       </w:r>
     </w:p>
     <w:p>
@@ -1911,7 +1450,7 @@
           </w:tcPr>
           <w:p>
             <w:r>
-              <w:t>¥______</w:t>
+              <w:t>¥90,000.00</w:t>
             </w:r>
           </w:p>
         </w:tc>
@@ -1923,7 +1462,7 @@
           </w:tcPr>
           <w:p>
             <w:r>
-              <w:t>云资源与域名</w:t>
+              <w:t>云资源与域名（含预留测试服务器）</w:t>
             </w:r>
           </w:p>
         </w:tc>
@@ -1933,7 +1472,7 @@
           </w:tcPr>
           <w:p>
             <w:r>
-              <w:t>¥______</w:t>
+              <w:t>¥6,799.28</w:t>
             </w:r>
           </w:p>
         </w:tc>
@@ -1945,7 +1484,7 @@
           </w:tcPr>
           <w:p>
             <w:r>
-              <w:t>微信生态开通</w:t>
+              <w:t>微信生态与企业微信认证</w:t>
             </w:r>
           </w:p>
         </w:tc>
@@ -1955,7 +1494,7 @@
           </w:tcPr>
           <w:p>
             <w:r>
-              <w:t>¥______</w:t>
+              <w:t>¥900.00</w:t>
             </w:r>
           </w:p>
         </w:tc>
@@ -1977,7 +1516,29 @@
           </w:tcPr>
           <w:p>
             <w:r>
-              <w:t>¥______</w:t>
+              <w:t>待确认</w:t>
+            </w:r>
+          </w:p>
+        </w:tc>
+      </w:tr>
+      <w:tr>
+        <w:tc>
+          <w:tcPr>
+            <w:tcW w:type="dxa" w:w="4759"/>
+          </w:tcPr>
+          <w:p>
+            <w:r>
+              <w:t>已确认小计（不含会议沟通费）</w:t>
+            </w:r>
+          </w:p>
+        </w:tc>
+        <w:tc>
+          <w:tcPr>
+            <w:tcW w:type="dxa" w:w="4759"/>
+          </w:tcPr>
+          <w:p>
+            <w:r>
+              <w:t>¥97,699.28</w:t>
             </w:r>
           </w:p>
         </w:tc>
@@ -1999,7 +1560,7 @@
           </w:tcPr>
           <w:p>
             <w:r>
-              <w:t>¥______</w:t>
+              <w:t>¥97,699.28 + 待确认会议沟通费</w:t>
             </w:r>
           </w:p>
         </w:tc>
@@ -2189,7 +1750,23 @@
         <w:pStyle w:val="ListBullet"/>
       </w:pPr>
       <w:r>
-        <w:t>阿里云、域名、微信生态的费用以实际账单为准，客户可自行采购或委托代付。</w:t>
+        <w:t>阿里云、域名、微信生态及企业微信费用以实际账单为准，客户可自行采购或委托代付。</w:t>
+      </w:r>
+    </w:p>
+    <w:p>
+      <w:pPr>
+        <w:pStyle w:val="ListBullet"/>
+      </w:pPr>
+      <w:r>
+        <w:t>预留测试服务器 4C8G 预计 ¥3,500，最终以阿里云实际报价为准。</w:t>
+      </w:r>
+    </w:p>
+    <w:p>
+      <w:pPr>
+        <w:pStyle w:val="ListBullet"/>
+      </w:pPr>
+      <w:r>
+        <w:t>DeepSeek 大模型开发与调用成本属于内部研发成本，不列入客户报价。</w:t>
       </w:r>
     </w:p>
     <w:p>
@@ -2229,7 +1806,7 @@
         <w:pStyle w:val="ListNumber"/>
       </w:pPr>
       <w:r>
-        <w:t>两名工程师的人日单价，或希望采用的整体包干价。</w:t>
+        <w:t>腾讯会议需求沟通与演示的计费方式：按次、按小时、打包服务费，或并入工程师人日。</w:t>
       </w:r>
     </w:p>
     <w:p>
@@ -2237,7 +1814,7 @@
         <w:pStyle w:val="ListNumber"/>
       </w:pPr>
       <w:r>
-        <w:t>阿里云 ECS、RDS MySQL 的具体配置和费用明细。</w:t>
+        <w:t>如需要，补充阿里云 ECS、RDS MySQL、域名、安全服务 3,299.28 元的单项拆分。</w:t>
       </w:r>
     </w:p>
     <w:p>
@@ -2245,23 +1822,7 @@
         <w:pStyle w:val="ListNumber"/>
       </w:pPr>
       <w:r>
-        <w:t>域名注册/续费、备案、DNS、SSL 费用明细。</w:t>
-      </w:r>
-    </w:p>
-    <w:p>
-      <w:pPr>
-        <w:pStyle w:val="ListNumber"/>
-      </w:pPr>
-      <w:r>
-        <w:t>微信公众号、微信小程序、企业微信的认证/开通费用明细。</w:t>
-      </w:r>
-    </w:p>
-    <w:p>
-      <w:pPr>
-        <w:pStyle w:val="ListNumber"/>
-      </w:pPr>
-      <w:r>
-        <w:t>腾讯会议沟通与演示的预计次数、频率和时长。</w:t>
+        <w:t>预留测试服务器 4C8G 的最终规格、期限与实际阿里云报价。</w:t>
       </w:r>
     </w:p>
     <w:sectPr>

</xml_diff>